<commit_message>
Newsletter neu gebaut 01.10.2026
</commit_message>
<xml_diff>
--- a/download/studien-aktuell.docx
+++ b/download/studien-aktuell.docx
@@ -62,7 +62,7 @@
           <w:color w:val="666666"/>
           <w:sz w:val="18"/>
         </w:rPr>
-        <w:t>Stand: 01.10.2026  |  6 Studien  |  kardio.m-vf.de</w:t>
+        <w:t>Stand: 01.10.2026  |  5 Studien  |  kardio.m-vf.de</w:t>
       </w:r>
     </w:p>
     <w:p>
@@ -361,64 +361,6 @@
           <w:sz w:val="18"/>
         </w:rPr>
         <w:t>https://pubmed.ncbi.nlm.nih.gov/42808156/</w:t>
-      </w:r>
-    </w:p>
-    <w:p>
-      <w:pPr>
-        <w:pStyle w:val="Heading2"/>
-      </w:pPr>
-      <w:r>
-        <w:t>Alternsassoziierte Entzündung verschärft Herzschaden nach Myokardinfarkt bei Mäusen</w:t>
-      </w:r>
-    </w:p>
-    <w:p>
-      <w:r>
-        <w:rPr>
-          <w:i/>
-          <w:color w:val="666666"/>
-          <w:sz w:val="18"/>
-        </w:rPr>
-        <w:t>Melika ET et al.  ·  J Mol Cell Cardiol  ·  28.09.2026  ·  PMID 42805582</w:t>
-      </w:r>
-    </w:p>
-    <w:p>
-      <w:r>
-        <w:t>Experimentelle Studie zur vergleichenden Analyse post-MI-Inflammations-Antworten in jungen und alten Mäusen mit Reporter-Transgenen für Interferon-gamma.</w:t>
-      </w:r>
-    </w:p>
-    <w:p>
-      <w:r>
-        <w:rPr>
-          <w:b/>
-        </w:rPr>
-        <w:t xml:space="preserve">Ergebnis: </w:t>
-      </w:r>
-      <w:r>
-        <w:t>Alte Mäuse zeigen konservierte IFN-γ-Produktionssignatur und erhöhte pro-inflammatorische Genexpression mit verstärkter IFN-γ-exprimierender T-Zell-Rekrutierung nach MI. Chronische Entzündung in älteren Tieren war mit Verschlimmerung des Remodellings und HI-Progression assoziiert. Akute post-MI-Reaktion kaum beeinträchtigt.</w:t>
-      </w:r>
-    </w:p>
-    <w:p>
-      <w:r>
-        <w:rPr>
-          <w:b/>
-          <w:sz w:val="19"/>
-        </w:rPr>
-        <w:t xml:space="preserve">Übertragbarkeit: </w:t>
-      </w:r>
-      <w:r>
-        <w:rPr>
-          <w:sz w:val="19"/>
-        </w:rPr>
-        <w:t>Grundmechanismus der altersassoziierten Herzinsuffizienz-Progression; präklinisches Modell zur Pathophysiologie.</w:t>
-      </w:r>
-    </w:p>
-    <w:p>
-      <w:r>
-        <w:rPr>
-          <w:color w:val="5A7D3A"/>
-          <w:sz w:val="18"/>
-        </w:rPr>
-        <w:t>https://pubmed.ncbi.nlm.nih.gov/42805582/</w:t>
       </w:r>
     </w:p>
     <w:sectPr>

</xml_diff>